<commit_message>
Finish all diagrams and SRS
</commit_message>
<xml_diff>
--- a/System Requirement Specification.docx
+++ b/System Requirement Specification.docx
@@ -5025,8 +5025,8 @@
       <w:u w:val="single"/>
     </w:rPr>
   </w:style>
-  <w:style w:type="character" w:styleId="FootnoteCharacters">
-    <w:name w:val="Footnote Characters"/>
+  <w:style w:type="character" w:styleId="FootnoteCharactersuser">
+    <w:name w:val="Footnote Characters (user)"/>
     <w:uiPriority w:val="99"/>
     <w:semiHidden/>
     <w:unhideWhenUsed/>
@@ -5035,8 +5035,8 @@
       <w:vertAlign w:val="superscript"/>
     </w:rPr>
   </w:style>
-  <w:style w:type="character" w:styleId="FootnoteCharactersuser">
-    <w:name w:val="Footnote Characters (user)"/>
+  <w:style w:type="character" w:styleId="FootnoteCharacters">
+    <w:name w:val="Footnote Characters"/>
     <w:qFormat/>
     <w:rPr>
       <w:vertAlign w:val="superscript"/>
@@ -5060,8 +5060,8 @@
       <w:szCs w:val="20"/>
     </w:rPr>
   </w:style>
-  <w:style w:type="character" w:styleId="EndnoteCharacters">
-    <w:name w:val="Endnote Characters"/>
+  <w:style w:type="character" w:styleId="EndnoteCharactersuser">
+    <w:name w:val="Endnote Characters (user)"/>
     <w:uiPriority w:val="99"/>
     <w:semiHidden/>
     <w:unhideWhenUsed/>
@@ -5070,8 +5070,8 @@
       <w:vertAlign w:val="superscript"/>
     </w:rPr>
   </w:style>
-  <w:style w:type="character" w:styleId="EndnoteCharactersuser">
-    <w:name w:val="Endnote Characters (user)"/>
+  <w:style w:type="character" w:styleId="EndnoteCharacters">
+    <w:name w:val="Endnote Characters"/>
     <w:qFormat/>
     <w:rPr>
       <w:vertAlign w:val="superscript"/>

</xml_diff>